<commit_message>
Reposition CV/resume as OT/ICS Systems Engineer, not cybersecurity analyst
Lead with 15+ years of hands-on BMS/PLC/BACnet/SCADA experience and move
County College of Morris ahead of LOGN Pacific in Experience. Cybersecurity
work becomes the differentiator rather than the headline, to target OT/ICS
and building automation engineering roles.

Co-Authored-By: Claude Sonnet 5 <noreply@anthropic.com>
</commit_message>
<xml_diff>
--- a/Santiago_Ruiz_Diaz_CV.docx
+++ b/Santiago_Ruiz_Diaz_CV.docx
@@ -31,7 +31,7 @@
           <w:sz w:val="20"/>
           <w:szCs w:val="20"/>
         </w:rPr>
-        <w:t xml:space="preserve">OT/ICS Cybersecurity Analyst  |  Security+ · CySA+ · PenTest+  |  15+ Years Critical Infrastructure</w:t>
+        <w:t xml:space="preserve">OT/ICS Systems Engineer  |  Building Automation &amp; Controls  |  Security+ · CySA+ · PenTest+  |  15+ Years Critical Infrastructure</w:t>
       </w:r>
     </w:p>
     <w:p>
@@ -100,7 +100,7 @@
           <w:sz w:val="19"/>
           <w:szCs w:val="19"/>
         </w:rPr>
-        <w:t xml:space="preserve">Cybersecurity professional with 15+ years of hands-on experience operating Operational Technology (OT) and Industrial Control Systems (ICS) — including Building Management Systems (BMS), SCADA-like controllers, PLC-driven systems, and BACnet networks — now applying that field-level OT knowledge directly in cybersecurity operations.</w:t>
+        <w:t xml:space="preserve">Operational Technology (OT) and Industrial Control Systems (ICS) professional with 15+ years of hands-on experience maintaining and troubleshooting Building Management Systems (BMS), SCADA-like controllers, PLC-driven automation (GCL+), and BACnet networks across a live, network-connected multi-building campus.</w:t>
       </w:r>
     </w:p>
     <w:p>
@@ -113,7 +113,7 @@
           <w:sz w:val="19"/>
           <w:szCs w:val="19"/>
         </w:rPr>
-        <w:t xml:space="preserve">Most cybersecurity analysts have never touched a PLC or walked a server room monitoring a BACnet controller. I have — for 15+ years. That operational context shapes how I approach threat detection, anomaly analysis, and incident response across IT and OT environments.</w:t>
+        <w:t xml:space="preserve">That field-level ownership — system monitoring, PLC logic repair, configuration changes, and access control administration across HVAC, boiler, and electrical infrastructure — is paired with a security engineering skill set most controls engineers don't have: vulnerability management, threat hunting, and endpoint detection across a ~200-server enterprise environment.</w:t>
       </w:r>
     </w:p>
     <w:p>
@@ -126,7 +126,7 @@
           <w:sz w:val="19"/>
           <w:szCs w:val="19"/>
         </w:rPr>
-        <w:t xml:space="preserve">Currently working as Security Engineer I at LOGN Pacific, delivering hands-on projects in Microsoft Sentinel, Defender for Endpoint (EDR), Tenable vulnerability management, and SOC threat hunting — while completing my B.S. in Cybersecurity &amp; Information Assurance at Western Governors University. Pursuing a Master's degree in Cybersecurity with enrollment planned for mid-2026.</w:t>
+        <w:t xml:space="preserve">Currently working as Security Engineer I at LOGN Pacific, delivering hands-on projects in Tenable vulnerability management, Microsoft Sentinel, and Defender for Endpoint — while completing my B.S. in Cybersecurity &amp; Information Assurance at Western Governors University. Pursuing a Master's degree in Cybersecurity with enrollment planned for mid-2026.</w:t>
       </w:r>
     </w:p>
     <w:p>
@@ -159,7 +159,7 @@
           <w:sz w:val="19"/>
           <w:szCs w:val="19"/>
         </w:rPr>
-        <w:t xml:space="preserve">SIEM  ·  Threat Hunting  ·  SOC Operations  ·  Alert Triage  ·  Incident Response  ·  Log Analysis  ·  Vulnerability Assessment  ·  EDR  ·  Endpoint Detection &amp; Response  ·  OT/ICS Security  ·  SCADA  ·  PLC  ·  GCL+  ·  BACnet  ·  BMS  ·  IEC 62443  ·  NIST 800-82  ·  NIST CSF  ·  NIST 800-53  ·  IT/OT Convergence  ·  Network Segmentation  ·  Purdue Model  ·  Zero Trust  ·  Privileged Access Management  ·  Access Control  ·  System Hardening  ·  Risk Assessment  ·  Python  ·  PowerShell  ·  Bash  ·  KQL  ·  Microsoft Sentinel  ·  Microsoft Defender for Endpoint  ·  Microsoft 365 Defender  ·  Tenable / Nessus  ·  Azure Security  ·  MITRE ATT&amp;CK  ·  DISA STIG</w:t>
+        <w:t xml:space="preserve">OT/ICS Operations  ·  Building Management Systems (BMS)  ·  SCADA  ·  PLC Programming &amp; Troubleshooting  ·  GCL+  ·  BACnet  ·  HVAC &amp; Electrical Infrastructure  ·  IEC 62443  ·  NIST 800-82  ·  IT/OT Convergence  ·  Network Segmentation  ·  Purdue Model  ·  System Monitoring &amp; Fault Diagnosis  ·  Access Control  ·  Privileged Access Management  ·  Change Management  ·  Risk Assessment  ·  SIEM  ·  Threat Hunting  ·  Incident Response  ·  Vulnerability Assessment  ·  EDR  ·  Zero Trust  ·  System Hardening  ·  Python  ·  PowerShell  ·  Bash  ·  KQL  ·  Microsoft Sentinel  ·  Microsoft Defender for Endpoint  ·  Tenable / Nessus  ·  Azure Security  ·  MITRE ATT&amp;CK  ·  DISA STIG  ·  NIST CSF  ·  NIST 800-53</w:t>
       </w:r>
     </w:p>
     <w:p>
@@ -421,7 +421,7 @@
           <w:sz w:val="22"/>
           <w:szCs w:val="22"/>
         </w:rPr>
-        <w:t xml:space="preserve">LOGN Pacific</w:t>
+        <w:t xml:space="preserve">County College of Morris</w:t>
       </w:r>
     </w:p>
     <w:p>
@@ -435,7 +435,7 @@
           <w:sz w:val="19"/>
           <w:szCs w:val="19"/>
         </w:rPr>
-        <w:t xml:space="preserve">Security Engineer I  ·  March 2026 – Present</w:t>
+        <w:t xml:space="preserve">HVAC &amp; Building Automation Systems Specialist  |  OT/ICS Operations  ·  November 2010 – Present  (15+ years)</w:t>
       </w:r>
     </w:p>
     <w:p>
@@ -448,7 +448,7 @@
           <w:sz w:val="19"/>
           <w:szCs w:val="19"/>
         </w:rPr>
-        <w:t xml:space="preserve">Hands-on security engineering role delivering threat detection, vulnerability management, incident investigation, and SOC operations across Microsoft Azure, Microsoft Sentinel, Defender for Endpoint (EDR), and Tenable.</w:t>
+        <w:t xml:space="preserve">Technical owner of critical building infrastructure across a network-connected, multi-building campus — operating and maintaining OT/ICS systems, SCADA-like controllers, BACnet-connected devices, and PLC-driven building automation across HVAC, boilers, and electrical infrastructure.</w:t>
       </w:r>
     </w:p>
     <w:p>
@@ -464,79 +464,43 @@
           <w:sz w:val="19"/>
           <w:szCs w:val="19"/>
         </w:rPr>
-        <w:t xml:space="preserve">  Vulnerability Management Program  (Tenable)</w:t>
-      </w:r>
-    </w:p>
-    <w:p>
-      <w:pPr>
-        <w:pStyle w:val="ListParagraph"/>
-        <w:numPr>
-          <w:ilvl w:val="0"/>
-          <w:numId w:val="1"/>
-        </w:numPr>
-        <w:spacing w:after="40" w:before="40" w:line="240" w:lineRule="auto"/>
-      </w:pPr>
-      <w:r>
-        <w:rPr>
-          <w:rFonts w:ascii="Calibri" w:cs="Calibri" w:eastAsia="Calibri" w:hAnsi="Calibri"/>
-          <w:sz w:val="19"/>
-          <w:szCs w:val="19"/>
-        </w:rPr>
-        <w:t xml:space="preserve">Implemented a full VM lifecycle across ~200-server enterprise environment (Windows Server 2025 &amp; Linux) using Tenable — authenticated and unauthenticated scans with DISA STIG scan templates.</w:t>
-      </w:r>
-    </w:p>
-    <w:p>
-      <w:pPr>
-        <w:pStyle w:val="ListParagraph"/>
-        <w:numPr>
-          <w:ilvl w:val="0"/>
-          <w:numId w:val="1"/>
-        </w:numPr>
-        <w:spacing w:after="40" w:before="40" w:line="240" w:lineRule="auto"/>
-      </w:pPr>
-      <w:r>
-        <w:rPr>
-          <w:rFonts w:ascii="Calibri" w:cs="Calibri" w:eastAsia="Calibri" w:hAnsi="Calibri"/>
-          <w:sz w:val="19"/>
-          <w:szCs w:val="19"/>
-        </w:rPr>
-        <w:t xml:space="preserve">Prioritized findings by CVSS score, asset criticality, and exposure: NTLMv1 disable, SMB signing enforcement, TLS 1.0/1.1 deprecation, and weak cipher remediation.</w:t>
-      </w:r>
-    </w:p>
-    <w:p>
-      <w:pPr>
-        <w:pStyle w:val="ListParagraph"/>
-        <w:numPr>
-          <w:ilvl w:val="0"/>
-          <w:numId w:val="1"/>
-        </w:numPr>
-        <w:spacing w:after="40" w:before="40" w:line="240" w:lineRule="auto"/>
-      </w:pPr>
-      <w:r>
-        <w:rPr>
-          <w:rFonts w:ascii="Calibri" w:cs="Calibri" w:eastAsia="Calibri" w:hAnsi="Calibri"/>
-          <w:sz w:val="19"/>
-          <w:szCs w:val="19"/>
-        </w:rPr>
-        <w:t xml:space="preserve">Built PowerShell scripts for automated Windows server remediation and Bash scripts for Linux server remediation at scale.</w:t>
-      </w:r>
-    </w:p>
-    <w:p>
-      <w:pPr>
-        <w:pStyle w:val="ListParagraph"/>
-        <w:numPr>
-          <w:ilvl w:val="0"/>
-          <w:numId w:val="1"/>
-        </w:numPr>
-        <w:spacing w:after="40" w:before="40" w:line="240" w:lineRule="auto"/>
-      </w:pPr>
-      <w:r>
-        <w:rPr>
-          <w:rFonts w:ascii="Calibri" w:cs="Calibri" w:eastAsia="Calibri" w:hAnsi="Calibri"/>
-          <w:sz w:val="19"/>
-          <w:szCs w:val="19"/>
-        </w:rPr>
-        <w:t xml:space="preserve">Facilitated CAB meetings, drafted VM policy aligned to NIST CSF and NIST 800-53, and drove executive sign-off and server team buy-in.</w:t>
+        <w:t xml:space="preserve">  PLC Scripting &amp; System Maintenance</w:t>
+      </w:r>
+    </w:p>
+    <w:p>
+      <w:pPr>
+        <w:pStyle w:val="ListParagraph"/>
+        <w:numPr>
+          <w:ilvl w:val="0"/>
+          <w:numId w:val="1"/>
+        </w:numPr>
+        <w:spacing w:after="40" w:before="40" w:line="240" w:lineRule="auto"/>
+      </w:pPr>
+      <w:r>
+        <w:rPr>
+          <w:rFonts w:ascii="Calibri" w:cs="Calibri" w:eastAsia="Calibri" w:hAnsi="Calibri"/>
+          <w:sz w:val="19"/>
+          <w:szCs w:val="19"/>
+        </w:rPr>
+        <w:t xml:space="preserve">Maintained, troubleshot, and repaired GCL+ PLC scripts across SCADA-like controllers and building automation systems — diagnosing and resolving logic errors and escalating out-of-scope issues to vendor/engineering teams.</w:t>
+      </w:r>
+    </w:p>
+    <w:p>
+      <w:pPr>
+        <w:pStyle w:val="ListParagraph"/>
+        <w:numPr>
+          <w:ilvl w:val="0"/>
+          <w:numId w:val="1"/>
+        </w:numPr>
+        <w:spacing w:after="40" w:before="40" w:line="240" w:lineRule="auto"/>
+      </w:pPr>
+      <w:r>
+        <w:rPr>
+          <w:rFonts w:ascii="Calibri" w:cs="Calibri" w:eastAsia="Calibri" w:hAnsi="Calibri"/>
+          <w:sz w:val="19"/>
+          <w:szCs w:val="19"/>
+        </w:rPr>
+        <w:t xml:space="preserve">Made configuration changes and system adjustments via BMS client terminal to maintain operational integrity across HVAC, boilers, and electrical infrastructure — minimizing downtime and unplanned outages.</w:t>
       </w:r>
     </w:p>
     <w:p>
@@ -552,97 +516,79 @@
           <w:sz w:val="19"/>
           <w:szCs w:val="19"/>
         </w:rPr>
-        <w:t xml:space="preserve">  Signal After The Noise  —  Post-Intrusion Threat Hunt  (Microsoft Sentinel)</w:t>
-      </w:r>
-    </w:p>
-    <w:p>
-      <w:pPr>
-        <w:pStyle w:val="ListParagraph"/>
-        <w:numPr>
-          <w:ilvl w:val="0"/>
-          <w:numId w:val="1"/>
-        </w:numPr>
-        <w:spacing w:after="40" w:before="40" w:line="240" w:lineRule="auto"/>
-      </w:pPr>
-      <w:r>
-        <w:rPr>
-          <w:rFonts w:ascii="Calibri" w:cs="Calibri" w:eastAsia="Calibri" w:hAnsi="Calibri"/>
-          <w:sz w:val="19"/>
-          <w:szCs w:val="19"/>
-        </w:rPr>
-        <w:t xml:space="preserve">Reconstructed a full adversary attack chain in Microsoft Sentinel across a simulated enterprise environment using SOC threat hunting methodology.</w:t>
-      </w:r>
-    </w:p>
-    <w:p>
-      <w:pPr>
-        <w:pStyle w:val="ListParagraph"/>
-        <w:numPr>
-          <w:ilvl w:val="0"/>
-          <w:numId w:val="1"/>
-        </w:numPr>
-        <w:spacing w:after="40" w:before="40" w:line="240" w:lineRule="auto"/>
-      </w:pPr>
-      <w:r>
-        <w:rPr>
-          <w:rFonts w:ascii="Calibri" w:cs="Calibri" w:eastAsia="Calibri" w:hAnsi="Calibri"/>
-          <w:sz w:val="19"/>
-          <w:szCs w:val="19"/>
-        </w:rPr>
-        <w:t xml:space="preserve">Authored 20+ KQL queries across 6 MDE log tables: DeviceLogonEvents, DeviceProcessEvents, DeviceFileEvents, DeviceNetworkEvents, DeviceRegistryEvents, and DeviceEvents.</w:t>
-      </w:r>
-    </w:p>
-    <w:p>
-      <w:pPr>
-        <w:pStyle w:val="ListParagraph"/>
-        <w:numPr>
-          <w:ilvl w:val="0"/>
-          <w:numId w:val="1"/>
-        </w:numPr>
-        <w:spacing w:after="40" w:before="40" w:line="240" w:lineRule="auto"/>
-      </w:pPr>
-      <w:r>
-        <w:rPr>
-          <w:rFonts w:ascii="Calibri" w:cs="Calibri" w:eastAsia="Calibri" w:hAnsi="Calibri"/>
-          <w:sz w:val="19"/>
-          <w:szCs w:val="19"/>
-        </w:rPr>
-        <w:t xml:space="preserve">Mapped full kill chain: T1078 (credential reuse) → T1021 (RDP lateral movement) → T1547.001 (persistence) → T1071.001 (C2 beaconing) → T1562.001 (AMSI evasion) → T1036 (LOLBin masquerade) → T1003.001 (LSASS credential dump).</w:t>
-      </w:r>
-    </w:p>
-    <w:p>
-      <w:pPr>
-        <w:pStyle w:val="ListParagraph"/>
-        <w:numPr>
-          <w:ilvl w:val="0"/>
-          <w:numId w:val="1"/>
-        </w:numPr>
-        <w:spacing w:after="40" w:before="40" w:line="240" w:lineRule="auto"/>
-      </w:pPr>
-      <w:r>
-        <w:rPr>
-          <w:rFonts w:ascii="Calibri" w:cs="Calibri" w:eastAsia="Calibri" w:hAnsi="Calibri"/>
-          <w:sz w:val="19"/>
-          <w:szCs w:val="19"/>
-        </w:rPr>
-        <w:t xml:space="preserve">Decoded Base64-encoded PowerShell payloads using KQL's base64_decode_tostring() to expose Cloudflare-fronted C2 infrastructure.</w:t>
-      </w:r>
-    </w:p>
-    <w:p>
-      <w:pPr>
-        <w:pStyle w:val="ListParagraph"/>
-        <w:numPr>
-          <w:ilvl w:val="0"/>
-          <w:numId w:val="1"/>
-        </w:numPr>
-        <w:spacing w:after="40" w:before="40" w:line="240" w:lineRule="auto"/>
-      </w:pPr>
-      <w:r>
-        <w:rPr>
-          <w:rFonts w:ascii="Calibri" w:cs="Calibri" w:eastAsia="Calibri" w:hAnsi="Calibri"/>
-          <w:sz w:val="19"/>
-          <w:szCs w:val="19"/>
-        </w:rPr>
-        <w:t xml:space="preserve">Produced full IOC table and MITRE ATT&amp;CK-mapped incident report.</w:t>
+        <w:t xml:space="preserve">  System Monitoring &amp; Incident Escalation</w:t>
+      </w:r>
+    </w:p>
+    <w:p>
+      <w:pPr>
+        <w:pStyle w:val="ListParagraph"/>
+        <w:numPr>
+          <w:ilvl w:val="0"/>
+          <w:numId w:val="1"/>
+        </w:numPr>
+        <w:spacing w:after="40" w:before="40" w:line="240" w:lineRule="auto"/>
+      </w:pPr>
+      <w:r>
+        <w:rPr>
+          <w:rFonts w:ascii="Calibri" w:cs="Calibri" w:eastAsia="Calibri" w:hAnsi="Calibri"/>
+          <w:sz w:val="19"/>
+          <w:szCs w:val="19"/>
+        </w:rPr>
+        <w:t xml:space="preserve">Monitored operational integrity of networked control systems across 15+ campus buildings, identifying anomalous behavior and system faults across BACnet-connected devices and electronic controls.</w:t>
+      </w:r>
+    </w:p>
+    <w:p>
+      <w:pPr>
+        <w:pStyle w:val="ListParagraph"/>
+        <w:numPr>
+          <w:ilvl w:val="0"/>
+          <w:numId w:val="1"/>
+        </w:numPr>
+        <w:spacing w:after="40" w:before="40" w:line="240" w:lineRule="auto"/>
+      </w:pPr>
+      <w:r>
+        <w:rPr>
+          <w:rFonts w:ascii="Calibri" w:cs="Calibri" w:eastAsia="Calibri" w:hAnsi="Calibri"/>
+          <w:sz w:val="19"/>
+          <w:szCs w:val="19"/>
+        </w:rPr>
+        <w:t xml:space="preserve">Identified and escalated potential risks and unresolvable issues to appropriate teams, supporting system reliability and continuity of campus operations.</w:t>
+      </w:r>
+    </w:p>
+    <w:p>
+      <w:pPr>
+        <w:pStyle w:val="ListParagraph"/>
+        <w:numPr>
+          <w:ilvl w:val="0"/>
+          <w:numId w:val="1"/>
+        </w:numPr>
+        <w:spacing w:after="40" w:before="40" w:line="240" w:lineRule="auto"/>
+      </w:pPr>
+      <w:r>
+        <w:rPr>
+          <w:rFonts w:ascii="Calibri" w:cs="Calibri" w:eastAsia="Calibri" w:hAnsi="Calibri"/>
+          <w:sz w:val="19"/>
+          <w:szCs w:val="19"/>
+        </w:rPr>
+        <w:t xml:space="preserve">Applied IT/OT convergence and network segmentation principles consistent with IEC 62443 and NIST 800-82 to isolate and protect building automation systems from the broader campus network.</w:t>
+      </w:r>
+    </w:p>
+    <w:p>
+      <w:pPr>
+        <w:pStyle w:val="ListParagraph"/>
+        <w:numPr>
+          <w:ilvl w:val="0"/>
+          <w:numId w:val="1"/>
+        </w:numPr>
+        <w:spacing w:after="40" w:before="40" w:line="240" w:lineRule="auto"/>
+      </w:pPr>
+      <w:r>
+        <w:rPr>
+          <w:rFonts w:ascii="Calibri" w:cs="Calibri" w:eastAsia="Calibri" w:hAnsi="Calibri"/>
+          <w:sz w:val="19"/>
+          <w:szCs w:val="19"/>
+        </w:rPr>
+        <w:t xml:space="preserve">Collaborated with leadership to align OT operations with organizational change management and security policies.</w:t>
       </w:r>
     </w:p>
     <w:p>
@@ -658,61 +604,43 @@
           <w:sz w:val="19"/>
           <w:szCs w:val="19"/>
         </w:rPr>
-        <w:t xml:space="preserve">  TOR Network Detection  (Microsoft Defender for Endpoint / EDR)</w:t>
-      </w:r>
-    </w:p>
-    <w:p>
-      <w:pPr>
-        <w:pStyle w:val="ListParagraph"/>
-        <w:numPr>
-          <w:ilvl w:val="0"/>
-          <w:numId w:val="1"/>
-        </w:numPr>
-        <w:spacing w:after="40" w:before="40" w:line="240" w:lineRule="auto"/>
-      </w:pPr>
-      <w:r>
-        <w:rPr>
-          <w:rFonts w:ascii="Calibri" w:cs="Calibri" w:eastAsia="Calibri" w:hAnsi="Calibri"/>
-          <w:sz w:val="19"/>
-          <w:szCs w:val="19"/>
-        </w:rPr>
-        <w:t xml:space="preserve">Confirmed unauthorized TOR browser usage on a corporate Azure Windows 11 endpoint via KQL across DeviceFileEvents, DeviceProcessEvents, and DeviceNetworkEvents.</w:t>
-      </w:r>
-    </w:p>
-    <w:p>
-      <w:pPr>
-        <w:pStyle w:val="ListParagraph"/>
-        <w:numPr>
-          <w:ilvl w:val="0"/>
-          <w:numId w:val="1"/>
-        </w:numPr>
-        <w:spacing w:after="40" w:before="40" w:line="240" w:lineRule="auto"/>
-      </w:pPr>
-      <w:r>
-        <w:rPr>
-          <w:rFonts w:ascii="Calibri" w:cs="Calibri" w:eastAsia="Calibri" w:hAnsi="Calibri"/>
-          <w:sz w:val="19"/>
-          <w:szCs w:val="19"/>
-        </w:rPr>
-        <w:t xml:space="preserve">Detected full TOR circuit — tor.exe to external relay on port 9001, firefox.exe from non-standard Desktop path to evade registry traces, suspicious file created and deleted to conceal activity.</w:t>
-      </w:r>
-    </w:p>
-    <w:p>
-      <w:pPr>
-        <w:pStyle w:val="ListParagraph"/>
-        <w:numPr>
-          <w:ilvl w:val="0"/>
-          <w:numId w:val="1"/>
-        </w:numPr>
-        <w:spacing w:after="40" w:before="40" w:line="240" w:lineRule="auto"/>
-      </w:pPr>
-      <w:r>
-        <w:rPr>
-          <w:rFonts w:ascii="Calibri" w:cs="Calibri" w:eastAsia="Calibri" w:hAnsi="Calibri"/>
-          <w:sz w:val="19"/>
-          <w:szCs w:val="19"/>
-        </w:rPr>
-        <w:t xml:space="preserve">Mapped to MITRE T1090.003 (proxy), T1204 (user execution), T1036 (masquerading). Delivered incident report with device isolation, HR/legal escalation, and perimeter block of TOR ports 9001–9151.</w:t>
+        <w:t xml:space="preserve">  Access Control &amp; Identity Management</w:t>
+      </w:r>
+    </w:p>
+    <w:p>
+      <w:pPr>
+        <w:pStyle w:val="ListParagraph"/>
+        <w:numPr>
+          <w:ilvl w:val="0"/>
+          <w:numId w:val="1"/>
+        </w:numPr>
+        <w:spacing w:after="40" w:before="40" w:line="240" w:lineRule="auto"/>
+      </w:pPr>
+      <w:r>
+        <w:rPr>
+          <w:rFonts w:ascii="Calibri" w:cs="Calibri" w:eastAsia="Calibri" w:hAnsi="Calibri"/>
+          <w:sz w:val="19"/>
+          <w:szCs w:val="19"/>
+        </w:rPr>
+        <w:t xml:space="preserve">Administered access control for building automation systems via BMS client terminal — provisioning, modifying, and revoking user permissions using least-privilege and privileged access management (PAM) principles.</w:t>
+      </w:r>
+    </w:p>
+    <w:p>
+      <w:pPr>
+        <w:pStyle w:val="ListParagraph"/>
+        <w:numPr>
+          <w:ilvl w:val="0"/>
+          <w:numId w:val="1"/>
+        </w:numPr>
+        <w:spacing w:after="40" w:before="40" w:line="240" w:lineRule="auto"/>
+      </w:pPr>
+      <w:r>
+        <w:rPr>
+          <w:rFonts w:ascii="Calibri" w:cs="Calibri" w:eastAsia="Calibri" w:hAnsi="Calibri"/>
+          <w:sz w:val="19"/>
+          <w:szCs w:val="19"/>
+        </w:rPr>
+        <w:t xml:space="preserve">Conducted periodic access reviews to ensure authorization aligned with current roles and responsibilities.</w:t>
       </w:r>
     </w:p>
     <w:p>
@@ -727,7 +655,7 @@
           <w:sz w:val="22"/>
           <w:szCs w:val="22"/>
         </w:rPr>
-        <w:t xml:space="preserve">County College of Morris</w:t>
+        <w:t xml:space="preserve">LOGN Pacific</w:t>
       </w:r>
     </w:p>
     <w:p>
@@ -741,7 +669,7 @@
           <w:sz w:val="19"/>
           <w:szCs w:val="19"/>
         </w:rPr>
-        <w:t xml:space="preserve">HVAC &amp; Building Automation Systems Specialist  |  OT/ICS Operations  ·  November 2010 – Present  (15+ years)</w:t>
+        <w:t xml:space="preserve">Security Engineer I  ·  March 2026 – Present</w:t>
       </w:r>
     </w:p>
     <w:p>
@@ -754,7 +682,7 @@
           <w:sz w:val="19"/>
           <w:szCs w:val="19"/>
         </w:rPr>
-        <w:t xml:space="preserve">Operating and maintaining critical building infrastructure across a network-connected campus — working directly with OT/ICS systems, SCADA-like controllers, BACnet-connected devices, and PLC-driven building automation across HVAC, boilers, and electrical infrastructure.</w:t>
+        <w:t xml:space="preserve">Security engineering role applying an OT-informed operational lens to threat detection, vulnerability management, and incident investigation across Microsoft Azure, Microsoft Sentinel, Defender for Endpoint (EDR), and Tenable.</w:t>
       </w:r>
     </w:p>
     <w:p>
@@ -770,61 +698,79 @@
           <w:sz w:val="19"/>
           <w:szCs w:val="19"/>
         </w:rPr>
-        <w:t xml:space="preserve">  System Monitoring &amp; Incident Escalation</w:t>
-      </w:r>
-    </w:p>
-    <w:p>
-      <w:pPr>
-        <w:pStyle w:val="ListParagraph"/>
-        <w:numPr>
-          <w:ilvl w:val="0"/>
-          <w:numId w:val="1"/>
-        </w:numPr>
-        <w:spacing w:after="40" w:before="40" w:line="240" w:lineRule="auto"/>
-      </w:pPr>
-      <w:r>
-        <w:rPr>
-          <w:rFonts w:ascii="Calibri" w:cs="Calibri" w:eastAsia="Calibri" w:hAnsi="Calibri"/>
-          <w:sz w:val="19"/>
-          <w:szCs w:val="19"/>
-        </w:rPr>
-        <w:t xml:space="preserve">Monitored operational integrity of networked control systems across 15+ campus buildings, identifying anomalous behavior and system faults across BACnet-connected devices and electronic controls.</w:t>
-      </w:r>
-    </w:p>
-    <w:p>
-      <w:pPr>
-        <w:pStyle w:val="ListParagraph"/>
-        <w:numPr>
-          <w:ilvl w:val="0"/>
-          <w:numId w:val="1"/>
-        </w:numPr>
-        <w:spacing w:after="40" w:before="40" w:line="240" w:lineRule="auto"/>
-      </w:pPr>
-      <w:r>
-        <w:rPr>
-          <w:rFonts w:ascii="Calibri" w:cs="Calibri" w:eastAsia="Calibri" w:hAnsi="Calibri"/>
-          <w:sz w:val="19"/>
-          <w:szCs w:val="19"/>
-        </w:rPr>
-        <w:t xml:space="preserve">Identified and escalated potential risks to appropriate teams in alignment with organizational change management and security policies — supporting campus operational continuity.</w:t>
-      </w:r>
-    </w:p>
-    <w:p>
-      <w:pPr>
-        <w:pStyle w:val="ListParagraph"/>
-        <w:numPr>
-          <w:ilvl w:val="0"/>
-          <w:numId w:val="1"/>
-        </w:numPr>
-        <w:spacing w:after="40" w:before="40" w:line="240" w:lineRule="auto"/>
-      </w:pPr>
-      <w:r>
-        <w:rPr>
-          <w:rFonts w:ascii="Calibri" w:cs="Calibri" w:eastAsia="Calibri" w:hAnsi="Calibri"/>
-          <w:sz w:val="19"/>
-          <w:szCs w:val="19"/>
-        </w:rPr>
-        <w:t xml:space="preserve">Applied IT/OT convergence and network segmentation principles consistent with IEC 62443 and NIST 800-82 to isolate and protect building automation systems.</w:t>
+        <w:t xml:space="preserve">  Vulnerability Management Program  (Tenable)</w:t>
+      </w:r>
+    </w:p>
+    <w:p>
+      <w:pPr>
+        <w:pStyle w:val="ListParagraph"/>
+        <w:numPr>
+          <w:ilvl w:val="0"/>
+          <w:numId w:val="1"/>
+        </w:numPr>
+        <w:spacing w:after="40" w:before="40" w:line="240" w:lineRule="auto"/>
+      </w:pPr>
+      <w:r>
+        <w:rPr>
+          <w:rFonts w:ascii="Calibri" w:cs="Calibri" w:eastAsia="Calibri" w:hAnsi="Calibri"/>
+          <w:sz w:val="19"/>
+          <w:szCs w:val="19"/>
+        </w:rPr>
+        <w:t xml:space="preserve">Implemented a full VM lifecycle across ~200-server enterprise environment (Windows Server 2025 &amp; Linux) using Tenable — authenticated and unauthenticated scans with DISA STIG scan templates.</w:t>
+      </w:r>
+    </w:p>
+    <w:p>
+      <w:pPr>
+        <w:pStyle w:val="ListParagraph"/>
+        <w:numPr>
+          <w:ilvl w:val="0"/>
+          <w:numId w:val="1"/>
+        </w:numPr>
+        <w:spacing w:after="40" w:before="40" w:line="240" w:lineRule="auto"/>
+      </w:pPr>
+      <w:r>
+        <w:rPr>
+          <w:rFonts w:ascii="Calibri" w:cs="Calibri" w:eastAsia="Calibri" w:hAnsi="Calibri"/>
+          <w:sz w:val="19"/>
+          <w:szCs w:val="19"/>
+        </w:rPr>
+        <w:t xml:space="preserve">Prioritized findings by CVSS score, asset criticality, and exposure: NTLMv1 disable, SMB signing enforcement, TLS 1.0/1.1 deprecation, and weak cipher remediation.</w:t>
+      </w:r>
+    </w:p>
+    <w:p>
+      <w:pPr>
+        <w:pStyle w:val="ListParagraph"/>
+        <w:numPr>
+          <w:ilvl w:val="0"/>
+          <w:numId w:val="1"/>
+        </w:numPr>
+        <w:spacing w:after="40" w:before="40" w:line="240" w:lineRule="auto"/>
+      </w:pPr>
+      <w:r>
+        <w:rPr>
+          <w:rFonts w:ascii="Calibri" w:cs="Calibri" w:eastAsia="Calibri" w:hAnsi="Calibri"/>
+          <w:sz w:val="19"/>
+          <w:szCs w:val="19"/>
+        </w:rPr>
+        <w:t xml:space="preserve">Built PowerShell scripts for automated Windows server remediation and Bash scripts for Linux server remediation at scale.</w:t>
+      </w:r>
+    </w:p>
+    <w:p>
+      <w:pPr>
+        <w:pStyle w:val="ListParagraph"/>
+        <w:numPr>
+          <w:ilvl w:val="0"/>
+          <w:numId w:val="1"/>
+        </w:numPr>
+        <w:spacing w:after="40" w:before="40" w:line="240" w:lineRule="auto"/>
+      </w:pPr>
+      <w:r>
+        <w:rPr>
+          <w:rFonts w:ascii="Calibri" w:cs="Calibri" w:eastAsia="Calibri" w:hAnsi="Calibri"/>
+          <w:sz w:val="19"/>
+          <w:szCs w:val="19"/>
+        </w:rPr>
+        <w:t xml:space="preserve">Facilitated CAB meetings, drafted VM policy aligned to NIST CSF and NIST 800-53, and drove executive sign-off and server team buy-in.</w:t>
       </w:r>
     </w:p>
     <w:p>
@@ -840,43 +786,97 @@
           <w:sz w:val="19"/>
           <w:szCs w:val="19"/>
         </w:rPr>
-        <w:t xml:space="preserve">  PLC Scripting &amp; System Maintenance</w:t>
-      </w:r>
-    </w:p>
-    <w:p>
-      <w:pPr>
-        <w:pStyle w:val="ListParagraph"/>
-        <w:numPr>
-          <w:ilvl w:val="0"/>
-          <w:numId w:val="1"/>
-        </w:numPr>
-        <w:spacing w:after="40" w:before="40" w:line="240" w:lineRule="auto"/>
-      </w:pPr>
-      <w:r>
-        <w:rPr>
-          <w:rFonts w:ascii="Calibri" w:cs="Calibri" w:eastAsia="Calibri" w:hAnsi="Calibri"/>
-          <w:sz w:val="19"/>
-          <w:szCs w:val="19"/>
-        </w:rPr>
-        <w:t xml:space="preserve">Maintained, troubleshot, and repaired GCL+ PLC scripts across SCADA-like controllers and building automation systems — resolving logic errors and escalating out-of-scope issues.</w:t>
-      </w:r>
-    </w:p>
-    <w:p>
-      <w:pPr>
-        <w:pStyle w:val="ListParagraph"/>
-        <w:numPr>
-          <w:ilvl w:val="0"/>
-          <w:numId w:val="1"/>
-        </w:numPr>
-        <w:spacing w:after="40" w:before="40" w:line="240" w:lineRule="auto"/>
-      </w:pPr>
-      <w:r>
-        <w:rPr>
-          <w:rFonts w:ascii="Calibri" w:cs="Calibri" w:eastAsia="Calibri" w:hAnsi="Calibri"/>
-          <w:sz w:val="19"/>
-          <w:szCs w:val="19"/>
-        </w:rPr>
-        <w:t xml:space="preserve">Made configuration changes via BMS client terminal to maintain operational integrity across HVAC, boilers, and electrical infrastructure.</w:t>
+        <w:t xml:space="preserve">  Signal After The Noise  —  Post-Intrusion Threat Hunt  (Microsoft Sentinel)</w:t>
+      </w:r>
+    </w:p>
+    <w:p>
+      <w:pPr>
+        <w:pStyle w:val="ListParagraph"/>
+        <w:numPr>
+          <w:ilvl w:val="0"/>
+          <w:numId w:val="1"/>
+        </w:numPr>
+        <w:spacing w:after="40" w:before="40" w:line="240" w:lineRule="auto"/>
+      </w:pPr>
+      <w:r>
+        <w:rPr>
+          <w:rFonts w:ascii="Calibri" w:cs="Calibri" w:eastAsia="Calibri" w:hAnsi="Calibri"/>
+          <w:sz w:val="19"/>
+          <w:szCs w:val="19"/>
+        </w:rPr>
+        <w:t xml:space="preserve">Reconstructed a full adversary attack chain in Microsoft Sentinel across a simulated enterprise environment using SOC threat hunting methodology.</w:t>
+      </w:r>
+    </w:p>
+    <w:p>
+      <w:pPr>
+        <w:pStyle w:val="ListParagraph"/>
+        <w:numPr>
+          <w:ilvl w:val="0"/>
+          <w:numId w:val="1"/>
+        </w:numPr>
+        <w:spacing w:after="40" w:before="40" w:line="240" w:lineRule="auto"/>
+      </w:pPr>
+      <w:r>
+        <w:rPr>
+          <w:rFonts w:ascii="Calibri" w:cs="Calibri" w:eastAsia="Calibri" w:hAnsi="Calibri"/>
+          <w:sz w:val="19"/>
+          <w:szCs w:val="19"/>
+        </w:rPr>
+        <w:t xml:space="preserve">Authored 20+ KQL queries across 6 MDE log tables: DeviceLogonEvents, DeviceProcessEvents, DeviceFileEvents, DeviceNetworkEvents, DeviceRegistryEvents, and DeviceEvents.</w:t>
+      </w:r>
+    </w:p>
+    <w:p>
+      <w:pPr>
+        <w:pStyle w:val="ListParagraph"/>
+        <w:numPr>
+          <w:ilvl w:val="0"/>
+          <w:numId w:val="1"/>
+        </w:numPr>
+        <w:spacing w:after="40" w:before="40" w:line="240" w:lineRule="auto"/>
+      </w:pPr>
+      <w:r>
+        <w:rPr>
+          <w:rFonts w:ascii="Calibri" w:cs="Calibri" w:eastAsia="Calibri" w:hAnsi="Calibri"/>
+          <w:sz w:val="19"/>
+          <w:szCs w:val="19"/>
+        </w:rPr>
+        <w:t xml:space="preserve">Mapped full kill chain: T1078 (credential reuse) → T1021 (RDP lateral movement) → T1547.001 (persistence) → T1071.001 (C2 beaconing) → T1562.001 (AMSI evasion) → T1036 (LOLBin masquerade) → T1003.001 (LSASS credential dump).</w:t>
+      </w:r>
+    </w:p>
+    <w:p>
+      <w:pPr>
+        <w:pStyle w:val="ListParagraph"/>
+        <w:numPr>
+          <w:ilvl w:val="0"/>
+          <w:numId w:val="1"/>
+        </w:numPr>
+        <w:spacing w:after="40" w:before="40" w:line="240" w:lineRule="auto"/>
+      </w:pPr>
+      <w:r>
+        <w:rPr>
+          <w:rFonts w:ascii="Calibri" w:cs="Calibri" w:eastAsia="Calibri" w:hAnsi="Calibri"/>
+          <w:sz w:val="19"/>
+          <w:szCs w:val="19"/>
+        </w:rPr>
+        <w:t xml:space="preserve">Decoded Base64-encoded PowerShell payloads using KQL's base64_decode_tostring() to expose Cloudflare-fronted C2 infrastructure.</w:t>
+      </w:r>
+    </w:p>
+    <w:p>
+      <w:pPr>
+        <w:pStyle w:val="ListParagraph"/>
+        <w:numPr>
+          <w:ilvl w:val="0"/>
+          <w:numId w:val="1"/>
+        </w:numPr>
+        <w:spacing w:after="40" w:before="40" w:line="240" w:lineRule="auto"/>
+      </w:pPr>
+      <w:r>
+        <w:rPr>
+          <w:rFonts w:ascii="Calibri" w:cs="Calibri" w:eastAsia="Calibri" w:hAnsi="Calibri"/>
+          <w:sz w:val="19"/>
+          <w:szCs w:val="19"/>
+        </w:rPr>
+        <w:t xml:space="preserve">Produced full IOC table and MITRE ATT&amp;CK-mapped incident report.</w:t>
       </w:r>
     </w:p>
     <w:p>
@@ -892,43 +892,61 @@
           <w:sz w:val="19"/>
           <w:szCs w:val="19"/>
         </w:rPr>
-        <w:t xml:space="preserve">  Access Control &amp; Identity Management</w:t>
-      </w:r>
-    </w:p>
-    <w:p>
-      <w:pPr>
-        <w:pStyle w:val="ListParagraph"/>
-        <w:numPr>
-          <w:ilvl w:val="0"/>
-          <w:numId w:val="1"/>
-        </w:numPr>
-        <w:spacing w:after="40" w:before="40" w:line="240" w:lineRule="auto"/>
-      </w:pPr>
-      <w:r>
-        <w:rPr>
-          <w:rFonts w:ascii="Calibri" w:cs="Calibri" w:eastAsia="Calibri" w:hAnsi="Calibri"/>
-          <w:sz w:val="19"/>
-          <w:szCs w:val="19"/>
-        </w:rPr>
-        <w:t xml:space="preserve">Administered access control for building automation systems via BMS client terminal — provisioning, modifying, and revoking user permissions using least-privilege and privileged access management (PAM) principles.</w:t>
-      </w:r>
-    </w:p>
-    <w:p>
-      <w:pPr>
-        <w:pStyle w:val="ListParagraph"/>
-        <w:numPr>
-          <w:ilvl w:val="0"/>
-          <w:numId w:val="1"/>
-        </w:numPr>
-        <w:spacing w:after="40" w:before="40" w:line="240" w:lineRule="auto"/>
-      </w:pPr>
-      <w:r>
-        <w:rPr>
-          <w:rFonts w:ascii="Calibri" w:cs="Calibri" w:eastAsia="Calibri" w:hAnsi="Calibri"/>
-          <w:sz w:val="19"/>
-          <w:szCs w:val="19"/>
-        </w:rPr>
-        <w:t xml:space="preserve">Conducted periodic access reviews to ensure authorization aligned with current roles and responsibilities.</w:t>
+        <w:t xml:space="preserve">  TOR Network Detection  (Microsoft Defender for Endpoint / EDR)</w:t>
+      </w:r>
+    </w:p>
+    <w:p>
+      <w:pPr>
+        <w:pStyle w:val="ListParagraph"/>
+        <w:numPr>
+          <w:ilvl w:val="0"/>
+          <w:numId w:val="1"/>
+        </w:numPr>
+        <w:spacing w:after="40" w:before="40" w:line="240" w:lineRule="auto"/>
+      </w:pPr>
+      <w:r>
+        <w:rPr>
+          <w:rFonts w:ascii="Calibri" w:cs="Calibri" w:eastAsia="Calibri" w:hAnsi="Calibri"/>
+          <w:sz w:val="19"/>
+          <w:szCs w:val="19"/>
+        </w:rPr>
+        <w:t xml:space="preserve">Confirmed unauthorized TOR browser usage on a corporate Azure Windows 11 endpoint via KQL across DeviceFileEvents, DeviceProcessEvents, and DeviceNetworkEvents.</w:t>
+      </w:r>
+    </w:p>
+    <w:p>
+      <w:pPr>
+        <w:pStyle w:val="ListParagraph"/>
+        <w:numPr>
+          <w:ilvl w:val="0"/>
+          <w:numId w:val="1"/>
+        </w:numPr>
+        <w:spacing w:after="40" w:before="40" w:line="240" w:lineRule="auto"/>
+      </w:pPr>
+      <w:r>
+        <w:rPr>
+          <w:rFonts w:ascii="Calibri" w:cs="Calibri" w:eastAsia="Calibri" w:hAnsi="Calibri"/>
+          <w:sz w:val="19"/>
+          <w:szCs w:val="19"/>
+        </w:rPr>
+        <w:t xml:space="preserve">Detected full TOR circuit — tor.exe to external relay on port 9001, firefox.exe from non-standard Desktop path to evade registry traces, suspicious file created and deleted to conceal activity.</w:t>
+      </w:r>
+    </w:p>
+    <w:p>
+      <w:pPr>
+        <w:pStyle w:val="ListParagraph"/>
+        <w:numPr>
+          <w:ilvl w:val="0"/>
+          <w:numId w:val="1"/>
+        </w:numPr>
+        <w:spacing w:after="40" w:before="40" w:line="240" w:lineRule="auto"/>
+      </w:pPr>
+      <w:r>
+        <w:rPr>
+          <w:rFonts w:ascii="Calibri" w:cs="Calibri" w:eastAsia="Calibri" w:hAnsi="Calibri"/>
+          <w:sz w:val="19"/>
+          <w:szCs w:val="19"/>
+        </w:rPr>
+        <w:t xml:space="preserve">Mapped to MITRE T1090.003 (proxy), T1204 (user execution), T1036 (masquerading). Delivered incident report with device isolation, HR/legal escalation, and perimeter block of TOR ports 9001–9151.</w:t>
       </w:r>
     </w:p>
     <w:p>

</xml_diff>